<commit_message>
"Updated BMR generator module to wrap all substituted parameters in bold formatting and to ensure the first word in each description (from operations.js) appears in bold in the DOCX output."
</commit_message>
<xml_diff>
--- a/TP.3 ATI_BMR.docx
+++ b/TP.3 ATI_BMR.docx
@@ -55,7 +55,14 @@
         <w:tc>
           <w:p>
             <w:r>
-              <w:t xml:space="preserve">Prepare the reactor:</w:t>
+              <w:rPr>
+                <w:b/>
+                <w:bCs/>
+              </w:rPr>
+              <w:t xml:space="preserve">Prepare</w:t>
+            </w:r>
+            <w:r>
+              <w:t xml:space="preserve"> the reactor:</w:t>
             </w:r>
           </w:p>
         </w:tc>
@@ -82,18 +89,21 @@
           </w:p>
         </w:tc>
         <w:tc>
-          <w:p>
-            <w:r>
-              <w:t xml:space="preserve"/>
-            </w:r>
-          </w:p>
+          <w:p/>
         </w:tc>
       </w:tr>
       <w:tr>
         <w:tc>
           <w:p>
             <w:r>
-              <w:t xml:space="preserve">Load required amount of Methanol into Reactor:</w:t>
+              <w:rPr>
+                <w:b/>
+                <w:bCs/>
+              </w:rPr>
+              <w:t xml:space="preserve">Load</w:t>
+            </w:r>
+            <w:r>
+              <w:t xml:space="preserve"> required amount of Methanol into Reactor:</w:t>
             </w:r>
           </w:p>
           <w:p>
@@ -113,39 +123,71 @@
           </w:p>
           <w:p>
             <w:r>
-              <w:t xml:space="preserve">4. Set/Keep stirring rate in reactor 002-XX to 150-200rpm.</w:t>
-            </w:r>
-          </w:p>
-          <w:p>
-            <w:r>
-              <w:t xml:space="preserve">5. Set temperature on thermostat 011-XX to rt/not controlled.</w:t>
-            </w:r>
-          </w:p>
-          <w:p>
-            <w:r>
-              <w:t xml:space="preserve">6. Keep the temperature of reaction mixture in range: 15-25°C.</w:t>
-            </w:r>
-          </w:p>
-          <w:p>
-            <w:r>
-              <w:t xml:space="preserve">7. Addition is done - in one portioin.</w:t>
-            </w:r>
-          </w:p>
-          <w:p>
-            <w:r>
-              <w:t xml:space="preserve"/>
-            </w:r>
-          </w:p>
+              <w:t xml:space="preserve">4. Set/Keep stirring rate in reactor 002-XX to </w:t>
+            </w:r>
+            <w:r>
+              <w:rPr>
+                <w:b/>
+                <w:bCs/>
+              </w:rPr>
+              <w:t xml:space="preserve">150-200rpm</w:t>
+            </w:r>
+            <w:r>
+              <w:t xml:space="preserve">.</w:t>
+            </w:r>
+          </w:p>
+          <w:p>
+            <w:r>
+              <w:t xml:space="preserve">5. Set temperature on thermostat 011-XX to </w:t>
+            </w:r>
+            <w:r>
+              <w:rPr>
+                <w:b/>
+                <w:bCs/>
+              </w:rPr>
+              <w:t xml:space="preserve">rt/not controlled</w:t>
+            </w:r>
+            <w:r>
+              <w:t xml:space="preserve">.</w:t>
+            </w:r>
+          </w:p>
+          <w:p>
+            <w:r>
+              <w:t xml:space="preserve">6. Keep the temperature of reaction mixture in range: </w:t>
+            </w:r>
+            <w:r>
+              <w:rPr>
+                <w:b/>
+                <w:bCs/>
+              </w:rPr>
+              <w:t xml:space="preserve">15-25°C</w:t>
+            </w:r>
+            <w:r>
+              <w:t xml:space="preserve">.</w:t>
+            </w:r>
+          </w:p>
+          <w:p>
+            <w:r>
+              <w:t xml:space="preserve">7. Addition is done - </w:t>
+            </w:r>
+            <w:r>
+              <w:rPr>
+                <w:b/>
+                <w:bCs/>
+              </w:rPr>
+              <w:t xml:space="preserve">in one portioin</w:t>
+            </w:r>
+            <w:r>
+              <w:t xml:space="preserve">.</w:t>
+            </w:r>
+          </w:p>
+          <w:p/>
           <w:p>
             <w:r>
               <w:t xml:space="preserve">Record required parameters into table XX.</w:t>
             </w:r>
           </w:p>
-          <w:p>
-            <w:r>
-              <w:t xml:space="preserve"/>
-            </w:r>
-          </w:p>
+          <w:p/>
           <w:p>
             <w:r>
               <w:t xml:space="preserve">Specified loading: ….. kg (range: … - … kg)</w:t>
@@ -180,48 +222,39 @@
               <w:t xml:space="preserve">Actual Set temp: ......... °C;</w:t>
             </w:r>
           </w:p>
-          <w:p>
-            <w:r>
-              <w:t xml:space="preserve"/>
-            </w:r>
-          </w:p>
+          <w:p/>
           <w:p>
             <w:r>
               <w:t xml:space="preserve">Actual Temp. of rm: ......... °C;</w:t>
             </w:r>
           </w:p>
-          <w:p>
-            <w:r>
-              <w:t xml:space="preserve"/>
-            </w:r>
-          </w:p>
+          <w:p/>
           <w:p>
             <w:r>
               <w:t xml:space="preserve">Actual Stirring: ......... rpm;</w:t>
             </w:r>
           </w:p>
-          <w:p>
-            <w:r>
-              <w:t xml:space="preserve"/>
-            </w:r>
-          </w:p>
+          <w:p/>
           <w:p>
             <w:r>
               <w:t xml:space="preserve">Actual Addition rate: .........;</w:t>
             </w:r>
           </w:p>
-          <w:p>
-            <w:r>
-              <w:t xml:space="preserve"/>
-            </w:r>
-          </w:p>
+          <w:p/>
         </w:tc>
       </w:tr>
       <w:tr>
         <w:tc>
           <w:p>
             <w:r>
-              <w:t xml:space="preserve">Load required amount of IP.2 into Reactor 002-XX:</w:t>
+              <w:rPr>
+                <w:b/>
+                <w:bCs/>
+              </w:rPr>
+              <w:t xml:space="preserve">Load</w:t>
+            </w:r>
+            <w:r>
+              <w:t xml:space="preserve"> required amount of IP.2 into Reactor 002-XX:</w:t>
             </w:r>
           </w:p>
           <w:p>
@@ -241,39 +274,71 @@
           </w:p>
           <w:p>
             <w:r>
-              <w:t xml:space="preserve">4. Set/Keep stirring rate in reactor 002-XX to 150-200rpm.</w:t>
-            </w:r>
-          </w:p>
-          <w:p>
-            <w:r>
-              <w:t xml:space="preserve">5. Set temperature on thermostat 011-XX to rt/not controlled.</w:t>
-            </w:r>
-          </w:p>
-          <w:p>
-            <w:r>
-              <w:t xml:space="preserve">6. Keep the temperature of reaction mixture in range: 15-25°C.</w:t>
-            </w:r>
-          </w:p>
-          <w:p>
-            <w:r>
-              <w:t xml:space="preserve">7. Addition is done - in one portioin.</w:t>
-            </w:r>
-          </w:p>
-          <w:p>
-            <w:r>
-              <w:t xml:space="preserve"/>
-            </w:r>
-          </w:p>
+              <w:t xml:space="preserve">4. Set/Keep stirring rate in reactor 002-XX to </w:t>
+            </w:r>
+            <w:r>
+              <w:rPr>
+                <w:b/>
+                <w:bCs/>
+              </w:rPr>
+              <w:t xml:space="preserve">150-200rpm</w:t>
+            </w:r>
+            <w:r>
+              <w:t xml:space="preserve">.</w:t>
+            </w:r>
+          </w:p>
+          <w:p>
+            <w:r>
+              <w:t xml:space="preserve">5. Set temperature on thermostat 011-XX to </w:t>
+            </w:r>
+            <w:r>
+              <w:rPr>
+                <w:b/>
+                <w:bCs/>
+              </w:rPr>
+              <w:t xml:space="preserve">rt/not controlled</w:t>
+            </w:r>
+            <w:r>
+              <w:t xml:space="preserve">.</w:t>
+            </w:r>
+          </w:p>
+          <w:p>
+            <w:r>
+              <w:t xml:space="preserve">6. Keep the temperature of reaction mixture in range: </w:t>
+            </w:r>
+            <w:r>
+              <w:rPr>
+                <w:b/>
+                <w:bCs/>
+              </w:rPr>
+              <w:t xml:space="preserve">15-25°C</w:t>
+            </w:r>
+            <w:r>
+              <w:t xml:space="preserve">.</w:t>
+            </w:r>
+          </w:p>
+          <w:p>
+            <w:r>
+              <w:t xml:space="preserve">7. Addition is done - </w:t>
+            </w:r>
+            <w:r>
+              <w:rPr>
+                <w:b/>
+                <w:bCs/>
+              </w:rPr>
+              <w:t xml:space="preserve">in one portioin</w:t>
+            </w:r>
+            <w:r>
+              <w:t xml:space="preserve">.</w:t>
+            </w:r>
+          </w:p>
+          <w:p/>
           <w:p>
             <w:r>
               <w:t xml:space="preserve">Record required parameters into table XX.</w:t>
             </w:r>
           </w:p>
-          <w:p>
-            <w:r>
-              <w:t xml:space="preserve"/>
-            </w:r>
-          </w:p>
+          <w:p/>
           <w:p>
             <w:r>
               <w:t xml:space="preserve">Specified loading: ….. kg (range: … - … kg)</w:t>
@@ -308,48 +373,39 @@
               <w:t xml:space="preserve">Actual Set temp: ......... °C;</w:t>
             </w:r>
           </w:p>
-          <w:p>
-            <w:r>
-              <w:t xml:space="preserve"/>
-            </w:r>
-          </w:p>
+          <w:p/>
           <w:p>
             <w:r>
               <w:t xml:space="preserve">Actual Temp. of rm: ......... °C;</w:t>
             </w:r>
           </w:p>
-          <w:p>
-            <w:r>
-              <w:t xml:space="preserve"/>
-            </w:r>
-          </w:p>
+          <w:p/>
           <w:p>
             <w:r>
               <w:t xml:space="preserve">Actual Stirring: ......... rpm;</w:t>
             </w:r>
           </w:p>
-          <w:p>
-            <w:r>
-              <w:t xml:space="preserve"/>
-            </w:r>
-          </w:p>
+          <w:p/>
           <w:p>
             <w:r>
               <w:t xml:space="preserve">Actual Addition rate: .........;</w:t>
             </w:r>
           </w:p>
-          <w:p>
-            <w:r>
-              <w:t xml:space="preserve"/>
-            </w:r>
-          </w:p>
+          <w:p/>
         </w:tc>
       </w:tr>
       <w:tr>
         <w:tc>
           <w:p>
             <w:r>
-              <w:t xml:space="preserve">Load required amount of Hydrochloric acid 35% into Reactor:</w:t>
+              <w:rPr>
+                <w:b/>
+                <w:bCs/>
+              </w:rPr>
+              <w:t xml:space="preserve">Load</w:t>
+            </w:r>
+            <w:r>
+              <w:t xml:space="preserve"> required amount of Hydrochloric acid 35% into Reactor:</w:t>
             </w:r>
           </w:p>
           <w:p>
@@ -369,39 +425,71 @@
           </w:p>
           <w:p>
             <w:r>
-              <w:t xml:space="preserve">4. Set/Keep stirring rate in reactor 002-XX to 150-200rpm.</w:t>
-            </w:r>
-          </w:p>
-          <w:p>
-            <w:r>
-              <w:t xml:space="preserve">5. Set temperature on thermostat 011-XX to rt/not controlled.</w:t>
-            </w:r>
-          </w:p>
-          <w:p>
-            <w:r>
-              <w:t xml:space="preserve">6. Keep the temperature of reaction mixture in range: 15-25°C.</w:t>
-            </w:r>
-          </w:p>
-          <w:p>
-            <w:r>
-              <w:t xml:space="preserve">7. Addition is done - in one portioin, pump with perist pump (60-80%).</w:t>
-            </w:r>
-          </w:p>
-          <w:p>
-            <w:r>
-              <w:t xml:space="preserve"/>
-            </w:r>
-          </w:p>
+              <w:t xml:space="preserve">4. Set/Keep stirring rate in reactor 002-XX to </w:t>
+            </w:r>
+            <w:r>
+              <w:rPr>
+                <w:b/>
+                <w:bCs/>
+              </w:rPr>
+              <w:t xml:space="preserve">150-200rpm</w:t>
+            </w:r>
+            <w:r>
+              <w:t xml:space="preserve">.</w:t>
+            </w:r>
+          </w:p>
+          <w:p>
+            <w:r>
+              <w:t xml:space="preserve">5. Set temperature on thermostat 011-XX to </w:t>
+            </w:r>
+            <w:r>
+              <w:rPr>
+                <w:b/>
+                <w:bCs/>
+              </w:rPr>
+              <w:t xml:space="preserve">rt/not controlled</w:t>
+            </w:r>
+            <w:r>
+              <w:t xml:space="preserve">.</w:t>
+            </w:r>
+          </w:p>
+          <w:p>
+            <w:r>
+              <w:t xml:space="preserve">6. Keep the temperature of reaction mixture in range: </w:t>
+            </w:r>
+            <w:r>
+              <w:rPr>
+                <w:b/>
+                <w:bCs/>
+              </w:rPr>
+              <w:t xml:space="preserve">15-25°C</w:t>
+            </w:r>
+            <w:r>
+              <w:t xml:space="preserve">.</w:t>
+            </w:r>
+          </w:p>
+          <w:p>
+            <w:r>
+              <w:t xml:space="preserve">7. Addition is done - </w:t>
+            </w:r>
+            <w:r>
+              <w:rPr>
+                <w:b/>
+                <w:bCs/>
+              </w:rPr>
+              <w:t xml:space="preserve">in one portioin, pump with perist pump (60-80%)</w:t>
+            </w:r>
+            <w:r>
+              <w:t xml:space="preserve">.</w:t>
+            </w:r>
+          </w:p>
+          <w:p/>
           <w:p>
             <w:r>
               <w:t xml:space="preserve">Record required parameters into table XX.</w:t>
             </w:r>
           </w:p>
-          <w:p>
-            <w:r>
-              <w:t xml:space="preserve"/>
-            </w:r>
-          </w:p>
+          <w:p/>
           <w:p>
             <w:r>
               <w:t xml:space="preserve">Specified loading: ….. kg (range: … - … kg)</w:t>
@@ -436,48 +524,39 @@
               <w:t xml:space="preserve">Actual Set temp: ......... °C;</w:t>
             </w:r>
           </w:p>
-          <w:p>
-            <w:r>
-              <w:t xml:space="preserve"/>
-            </w:r>
-          </w:p>
+          <w:p/>
           <w:p>
             <w:r>
               <w:t xml:space="preserve">Actual Temp. of rm: ......... °C;</w:t>
             </w:r>
           </w:p>
-          <w:p>
-            <w:r>
-              <w:t xml:space="preserve"/>
-            </w:r>
-          </w:p>
+          <w:p/>
           <w:p>
             <w:r>
               <w:t xml:space="preserve">Actual Stirring: ......... rpm;</w:t>
             </w:r>
           </w:p>
-          <w:p>
-            <w:r>
-              <w:t xml:space="preserve"/>
-            </w:r>
-          </w:p>
+          <w:p/>
           <w:p>
             <w:r>
               <w:t xml:space="preserve">Actual Addition rate: .........;</w:t>
             </w:r>
           </w:p>
-          <w:p>
-            <w:r>
-              <w:t xml:space="preserve"/>
-            </w:r>
-          </w:p>
+          <w:p/>
         </w:tc>
       </w:tr>
       <w:tr>
         <w:tc>
           <w:p>
             <w:r>
-              <w:t xml:space="preserve">Start a heating/cooling operation:</w:t>
+              <w:rPr>
+                <w:b/>
+                <w:bCs/>
+              </w:rPr>
+              <w:t xml:space="preserve">Start</w:t>
+            </w:r>
+            <w:r>
+              <w:t xml:space="preserve"> a heating/cooling operation:</w:t>
             </w:r>
           </w:p>
           <w:p>
@@ -487,29 +566,65 @@
           </w:p>
           <w:p>
             <w:r>
-              <w:t xml:space="preserve">2. Set temperature on thermostat 011-XX to 75-80°C.</w:t>
-            </w:r>
-          </w:p>
-          <w:p>
-            <w:r>
-              <w:t xml:space="preserve">3. Keep the temperature of reaction mixture in range: 65-69°C (mild reflux).</w:t>
-            </w:r>
-          </w:p>
-          <w:p>
-            <w:r>
-              <w:t xml:space="preserve">4. Provide temperature gradient: straight heating to the required temperature..</w:t>
-            </w:r>
-          </w:p>
-          <w:p>
-            <w:r>
-              <w:t xml:space="preserve">5. Set/Keep stirring rate to 150-200rpm.</w:t>
-            </w:r>
-          </w:p>
-          <w:p>
-            <w:r>
-              <w:t xml:space="preserve"/>
-            </w:r>
-          </w:p>
+              <w:t xml:space="preserve">2. Set temperature on thermostat 011-XX to </w:t>
+            </w:r>
+            <w:r>
+              <w:rPr>
+                <w:b/>
+                <w:bCs/>
+              </w:rPr>
+              <w:t xml:space="preserve">75-80°C</w:t>
+            </w:r>
+            <w:r>
+              <w:t xml:space="preserve">.</w:t>
+            </w:r>
+          </w:p>
+          <w:p>
+            <w:r>
+              <w:t xml:space="preserve">3. Keep the temperature of reaction mixture in range: </w:t>
+            </w:r>
+            <w:r>
+              <w:rPr>
+                <w:b/>
+                <w:bCs/>
+              </w:rPr>
+              <w:t xml:space="preserve">65-69°C (mild reflux)</w:t>
+            </w:r>
+            <w:r>
+              <w:t xml:space="preserve">.</w:t>
+            </w:r>
+          </w:p>
+          <w:p>
+            <w:r>
+              <w:t xml:space="preserve">4. Provide temperature gradient: </w:t>
+            </w:r>
+            <w:r>
+              <w:rPr>
+                <w:b/>
+                <w:bCs/>
+              </w:rPr>
+              <w:t xml:space="preserve">straight heating to the required temperature.</w:t>
+            </w:r>
+            <w:r>
+              <w:t xml:space="preserve">.</w:t>
+            </w:r>
+          </w:p>
+          <w:p>
+            <w:r>
+              <w:t xml:space="preserve">5. Set/Keep stirring rate to </w:t>
+            </w:r>
+            <w:r>
+              <w:rPr>
+                <w:b/>
+                <w:bCs/>
+              </w:rPr>
+              <w:t xml:space="preserve">150-200rpm</w:t>
+            </w:r>
+            <w:r>
+              <w:t xml:space="preserve">.</w:t>
+            </w:r>
+          </w:p>
+          <w:p/>
           <w:p>
             <w:r>
               <w:t xml:space="preserve">Record required parameters into table XX.</w:t>
@@ -544,80 +659,117 @@
               <w:t xml:space="preserve">Actual Set temp.: .........;</w:t>
             </w:r>
           </w:p>
-          <w:p>
-            <w:r>
-              <w:t xml:space="preserve"/>
-            </w:r>
-          </w:p>
+          <w:p/>
           <w:p>
             <w:r>
               <w:t xml:space="preserve">Actual Target Temp.: .........;</w:t>
             </w:r>
           </w:p>
-          <w:p>
-            <w:r>
-              <w:t xml:space="preserve"/>
-            </w:r>
-          </w:p>
+          <w:p/>
           <w:p>
             <w:r>
               <w:t xml:space="preserve">Actual cooling/heating grad.: .........;</w:t>
             </w:r>
           </w:p>
-          <w:p>
-            <w:r>
-              <w:t xml:space="preserve"/>
-            </w:r>
-          </w:p>
+          <w:p/>
           <w:p>
             <w:r>
               <w:t xml:space="preserve">Actual Stirring: ......... rpm;</w:t>
             </w:r>
           </w:p>
-          <w:p>
-            <w:r>
-              <w:t xml:space="preserve"/>
-            </w:r>
-          </w:p>
+          <w:p/>
         </w:tc>
       </w:tr>
       <w:tr>
         <w:tc>
           <w:p>
             <w:r>
-              <w:t xml:space="preserve">Start a hold time operation:</w:t>
-            </w:r>
-          </w:p>
-          <w:p>
-            <w:r>
-              <w:t xml:space="preserve">1. Set temperature on thermostat 011-XX to 75-80°C.</w:t>
-            </w:r>
-          </w:p>
-          <w:p>
-            <w:r>
-              <w:t xml:space="preserve">2. Keep the temperature of reaction mixture in range: 67-70oC.</w:t>
-            </w:r>
-          </w:p>
-          <w:p>
-            <w:r>
-              <w:t xml:space="preserve">3. Adjust stirring rate to 150-200rpm.</w:t>
-            </w:r>
-          </w:p>
-          <w:p>
-            <w:r>
-              <w:t xml:space="preserve">4. Hold for duration: 3-6h (max 6h with IPC waiting time)..</w:t>
-            </w:r>
-          </w:p>
-          <w:p>
-            <w:r>
-              <w:t xml:space="preserve">5. Optional: Possible pause - NO.</w:t>
-            </w:r>
-          </w:p>
-          <w:p>
-            <w:r>
-              <w:t xml:space="preserve"/>
-            </w:r>
-          </w:p>
+              <w:rPr>
+                <w:b/>
+                <w:bCs/>
+              </w:rPr>
+              <w:t xml:space="preserve">Start</w:t>
+            </w:r>
+            <w:r>
+              <w:t xml:space="preserve"> a hold time operation:</w:t>
+            </w:r>
+          </w:p>
+          <w:p>
+            <w:r>
+              <w:t xml:space="preserve">1. Set temperature on thermostat 011-XX to </w:t>
+            </w:r>
+            <w:r>
+              <w:rPr>
+                <w:b/>
+                <w:bCs/>
+              </w:rPr>
+              <w:t xml:space="preserve">75-80°C</w:t>
+            </w:r>
+            <w:r>
+              <w:t xml:space="preserve">.</w:t>
+            </w:r>
+          </w:p>
+          <w:p>
+            <w:r>
+              <w:t xml:space="preserve">2. Keep the temperature of reaction mixture in range: </w:t>
+            </w:r>
+            <w:r>
+              <w:rPr>
+                <w:b/>
+                <w:bCs/>
+              </w:rPr>
+              <w:t xml:space="preserve">67-70oC</w:t>
+            </w:r>
+            <w:r>
+              <w:t xml:space="preserve">.</w:t>
+            </w:r>
+          </w:p>
+          <w:p>
+            <w:r>
+              <w:t xml:space="preserve">3. Adjust stirring rate to </w:t>
+            </w:r>
+            <w:r>
+              <w:rPr>
+                <w:b/>
+                <w:bCs/>
+              </w:rPr>
+              <w:t xml:space="preserve">150-200rpm</w:t>
+            </w:r>
+            <w:r>
+              <w:t xml:space="preserve">.</w:t>
+            </w:r>
+          </w:p>
+          <w:p>
+            <w:r>
+              <w:t xml:space="preserve">4. Hold for duration: </w:t>
+            </w:r>
+            <w:r>
+              <w:rPr>
+                <w:b/>
+                <w:bCs/>
+              </w:rPr>
+              <w:t xml:space="preserve">3-6h (max 6h with IPC waiting time).</w:t>
+            </w:r>
+            <w:r>
+              <w:t xml:space="preserve">.</w:t>
+            </w:r>
+          </w:p>
+          <w:p>
+            <w:r>
+              <w:t xml:space="preserve">5. Optional: Possible pause - </w:t>
+            </w:r>
+            <w:r>
+              <w:rPr>
+                <w:b/>
+                <w:bCs/>
+              </w:rPr>
+              <w:t xml:space="preserve">NO</w:t>
+            </w:r>
+            <w:r>
+              <w:t xml:space="preserve">.</w:t>
+            </w:r>
+          </w:p>
+          <w:p/>
           <w:p>
             <w:r>
               <w:t xml:space="preserve">Record required parameters into table XX.</w:t>
@@ -652,63 +804,60 @@
               <w:t xml:space="preserve">Actual Set temp.: .........;</w:t>
             </w:r>
           </w:p>
-          <w:p>
-            <w:r>
-              <w:t xml:space="preserve"/>
-            </w:r>
-          </w:p>
+          <w:p/>
           <w:p>
             <w:r>
               <w:t xml:space="preserve">Actual Target Temp.: .........;</w:t>
             </w:r>
           </w:p>
-          <w:p>
-            <w:r>
-              <w:t xml:space="preserve"/>
-            </w:r>
-          </w:p>
+          <w:p/>
           <w:p>
             <w:r>
               <w:t xml:space="preserve">Actual Stirring: ......... rpm;</w:t>
             </w:r>
           </w:p>
-          <w:p>
-            <w:r>
-              <w:t xml:space="preserve"/>
-            </w:r>
-          </w:p>
+          <w:p/>
           <w:p>
             <w:r>
               <w:t xml:space="preserve">Actual Time: .........;</w:t>
             </w:r>
           </w:p>
-          <w:p>
-            <w:r>
-              <w:t xml:space="preserve"/>
-            </w:r>
-          </w:p>
+          <w:p/>
           <w:p>
             <w:r>
               <w:t xml:space="preserve">Actual break point: .........;</w:t>
             </w:r>
           </w:p>
-          <w:p>
-            <w:r>
-              <w:t xml:space="preserve"/>
-            </w:r>
-          </w:p>
+          <w:p/>
         </w:tc>
       </w:tr>
       <w:tr>
         <w:tc>
           <w:p>
             <w:r>
-              <w:t xml:space="preserve">In-process control:</w:t>
-            </w:r>
-          </w:p>
-          <w:p>
-            <w:r>
-              <w:t xml:space="preserve">1. On IPC failure: continue heating for around 1-2h more and repeat IPC.</w:t>
+              <w:rPr>
+                <w:b/>
+                <w:bCs/>
+              </w:rPr>
+              <w:t xml:space="preserve">In-process</w:t>
+            </w:r>
+            <w:r>
+              <w:t xml:space="preserve"> control:</w:t>
+            </w:r>
+          </w:p>
+          <w:p>
+            <w:r>
+              <w:t xml:space="preserve">1. On IPC failure: </w:t>
+            </w:r>
+            <w:r>
+              <w:rPr>
+                <w:b/>
+                <w:bCs/>
+              </w:rPr>
+              <w:t xml:space="preserve">continue heating for around 1-2h more and repeat IPC</w:t>
+            </w:r>
+            <w:r>
+              <w:t xml:space="preserve">.</w:t>
             </w:r>
           </w:p>
         </w:tc>
@@ -740,38 +889,33 @@
               <w:t xml:space="preserve">Actual Exp. Result: .........;</w:t>
             </w:r>
           </w:p>
-          <w:p>
-            <w:r>
-              <w:t xml:space="preserve"/>
-            </w:r>
-          </w:p>
+          <w:p/>
           <w:p>
             <w:r>
               <w:t xml:space="preserve">Actual IPC Failure Action: .........;</w:t>
             </w:r>
           </w:p>
-          <w:p>
-            <w:r>
-              <w:t xml:space="preserve"/>
-            </w:r>
-          </w:p>
+          <w:p/>
           <w:p>
             <w:r>
               <w:t xml:space="preserve">Actual time of ipc: .........;</w:t>
             </w:r>
           </w:p>
-          <w:p>
-            <w:r>
-              <w:t xml:space="preserve"/>
-            </w:r>
-          </w:p>
+          <w:p/>
         </w:tc>
       </w:tr>
       <w:tr>
         <w:tc>
           <w:p>
             <w:r>
-              <w:t xml:space="preserve">Start a heating/cooling operation:</w:t>
+              <w:rPr>
+                <w:b/>
+                <w:bCs/>
+              </w:rPr>
+              <w:t xml:space="preserve">Start</w:t>
+            </w:r>
+            <w:r>
+              <w:t xml:space="preserve"> a heating/cooling operation:</w:t>
             </w:r>
           </w:p>
           <w:p>
@@ -781,29 +925,65 @@
           </w:p>
           <w:p>
             <w:r>
-              <w:t xml:space="preserve">2. Set temperature on thermostat 011-XX to 0-&gt;15°C.</w:t>
-            </w:r>
-          </w:p>
-          <w:p>
-            <w:r>
-              <w:t xml:space="preserve">3. Keep the temperature of reaction mixture in range: 15-25°C.</w:t>
-            </w:r>
-          </w:p>
-          <w:p>
-            <w:r>
-              <w:t xml:space="preserve">4. Provide temperature gradient: straight cooling to the required temperature..</w:t>
-            </w:r>
-          </w:p>
-          <w:p>
-            <w:r>
-              <w:t xml:space="preserve">5. Set/Keep stirring rate to 150-200rpm.</w:t>
-            </w:r>
-          </w:p>
-          <w:p>
-            <w:r>
-              <w:t xml:space="preserve"/>
-            </w:r>
-          </w:p>
+              <w:t xml:space="preserve">2. Set temperature on thermostat 011-XX to </w:t>
+            </w:r>
+            <w:r>
+              <w:rPr>
+                <w:b/>
+                <w:bCs/>
+              </w:rPr>
+              <w:t xml:space="preserve">0-&gt;15°C</w:t>
+            </w:r>
+            <w:r>
+              <w:t xml:space="preserve">.</w:t>
+            </w:r>
+          </w:p>
+          <w:p>
+            <w:r>
+              <w:t xml:space="preserve">3. Keep the temperature of reaction mixture in range: </w:t>
+            </w:r>
+            <w:r>
+              <w:rPr>
+                <w:b/>
+                <w:bCs/>
+              </w:rPr>
+              <w:t xml:space="preserve">15-25°C</w:t>
+            </w:r>
+            <w:r>
+              <w:t xml:space="preserve">.</w:t>
+            </w:r>
+          </w:p>
+          <w:p>
+            <w:r>
+              <w:t xml:space="preserve">4. Provide temperature gradient: </w:t>
+            </w:r>
+            <w:r>
+              <w:rPr>
+                <w:b/>
+                <w:bCs/>
+              </w:rPr>
+              <w:t xml:space="preserve">straight cooling to the required temperature.</w:t>
+            </w:r>
+            <w:r>
+              <w:t xml:space="preserve">.</w:t>
+            </w:r>
+          </w:p>
+          <w:p>
+            <w:r>
+              <w:t xml:space="preserve">5. Set/Keep stirring rate to </w:t>
+            </w:r>
+            <w:r>
+              <w:rPr>
+                <w:b/>
+                <w:bCs/>
+              </w:rPr>
+              <w:t xml:space="preserve">150-200rpm</w:t>
+            </w:r>
+            <w:r>
+              <w:t xml:space="preserve">.</w:t>
+            </w:r>
+          </w:p>
+          <w:p/>
           <w:p>
             <w:r>
               <w:t xml:space="preserve">Record required parameters into table XX.</w:t>
@@ -838,58 +1018,45 @@
               <w:t xml:space="preserve">Actual Set temp.: .........;</w:t>
             </w:r>
           </w:p>
-          <w:p>
-            <w:r>
-              <w:t xml:space="preserve"/>
-            </w:r>
-          </w:p>
+          <w:p/>
           <w:p>
             <w:r>
               <w:t xml:space="preserve">Actual Target Temp.: .........;</w:t>
             </w:r>
           </w:p>
-          <w:p>
-            <w:r>
-              <w:t xml:space="preserve"/>
-            </w:r>
-          </w:p>
+          <w:p/>
           <w:p>
             <w:r>
               <w:t xml:space="preserve">Actual cooling/heating grad.: .........;</w:t>
             </w:r>
           </w:p>
-          <w:p>
-            <w:r>
-              <w:t xml:space="preserve"/>
-            </w:r>
-          </w:p>
+          <w:p/>
           <w:p>
             <w:r>
               <w:t xml:space="preserve">Actual Stirring: ......... rpm;</w:t>
             </w:r>
           </w:p>
-          <w:p>
-            <w:r>
-              <w:t xml:space="preserve"/>
-            </w:r>
-          </w:p>
+          <w:p/>
           <w:p>
             <w:r>
               <w:t xml:space="preserve">Actual break point: .........;</w:t>
             </w:r>
           </w:p>
-          <w:p>
-            <w:r>
-              <w:t xml:space="preserve"/>
-            </w:r>
-          </w:p>
+          <w:p/>
         </w:tc>
       </w:tr>
       <w:tr>
         <w:tc>
           <w:p>
             <w:r>
-              <w:t xml:space="preserve">Load required amount of Sodium hydroxide into the dropping funnel of Reactor 002-XX:</w:t>
+              <w:rPr>
+                <w:b/>
+                <w:bCs/>
+              </w:rPr>
+              <w:t xml:space="preserve">Load</w:t>
+            </w:r>
+            <w:r>
+              <w:t xml:space="preserve"> required amount of Sodium hydroxide into the dropping funnel of Reactor 002-XX:</w:t>
             </w:r>
           </w:p>
           <w:p>
@@ -909,39 +1076,71 @@
           </w:p>
           <w:p>
             <w:r>
-              <w:t xml:space="preserve">4. Set/Keep stirring rate in reactor 002-XX to 150-200rpm.</w:t>
-            </w:r>
-          </w:p>
-          <w:p>
-            <w:r>
-              <w:t xml:space="preserve">5. Set temperature on thermostat 011-XX to -10…-15°C.</w:t>
-            </w:r>
-          </w:p>
-          <w:p>
-            <w:r>
-              <w:t xml:space="preserve">6. Keep the temperature of reaction mixture in range: 0-30°C.</w:t>
-            </w:r>
-          </w:p>
-          <w:p>
-            <w:r>
-              <w:t xml:space="preserve">7. Addition is done - addition is temperature controlled.</w:t>
-            </w:r>
-          </w:p>
-          <w:p>
-            <w:r>
-              <w:t xml:space="preserve"/>
-            </w:r>
-          </w:p>
+              <w:t xml:space="preserve">4. Set/Keep stirring rate in reactor 002-XX to </w:t>
+            </w:r>
+            <w:r>
+              <w:rPr>
+                <w:b/>
+                <w:bCs/>
+              </w:rPr>
+              <w:t xml:space="preserve">150-200rpm</w:t>
+            </w:r>
+            <w:r>
+              <w:t xml:space="preserve">.</w:t>
+            </w:r>
+          </w:p>
+          <w:p>
+            <w:r>
+              <w:t xml:space="preserve">5. Set temperature on thermostat 011-XX to </w:t>
+            </w:r>
+            <w:r>
+              <w:rPr>
+                <w:b/>
+                <w:bCs/>
+              </w:rPr>
+              <w:t xml:space="preserve">-10…-15°C</w:t>
+            </w:r>
+            <w:r>
+              <w:t xml:space="preserve">.</w:t>
+            </w:r>
+          </w:p>
+          <w:p>
+            <w:r>
+              <w:t xml:space="preserve">6. Keep the temperature of reaction mixture in range: </w:t>
+            </w:r>
+            <w:r>
+              <w:rPr>
+                <w:b/>
+                <w:bCs/>
+              </w:rPr>
+              <w:t xml:space="preserve">0-30°C</w:t>
+            </w:r>
+            <w:r>
+              <w:t xml:space="preserve">.</w:t>
+            </w:r>
+          </w:p>
+          <w:p>
+            <w:r>
+              <w:t xml:space="preserve">7. Addition is done - </w:t>
+            </w:r>
+            <w:r>
+              <w:rPr>
+                <w:b/>
+                <w:bCs/>
+              </w:rPr>
+              <w:t xml:space="preserve">addition is temperature controlled</w:t>
+            </w:r>
+            <w:r>
+              <w:t xml:space="preserve">.</w:t>
+            </w:r>
+          </w:p>
+          <w:p/>
           <w:p>
             <w:r>
               <w:t xml:space="preserve">Record required parameters into table XX.</w:t>
             </w:r>
           </w:p>
-          <w:p>
-            <w:r>
-              <w:t xml:space="preserve"/>
-            </w:r>
-          </w:p>
+          <w:p/>
           <w:p>
             <w:r>
               <w:t xml:space="preserve">Specified loading: ….. kg (range: … - … kg)</w:t>
@@ -976,58 +1175,45 @@
               <w:t xml:space="preserve">Actual Set temp: ......... °C;</w:t>
             </w:r>
           </w:p>
-          <w:p>
-            <w:r>
-              <w:t xml:space="preserve"/>
-            </w:r>
-          </w:p>
+          <w:p/>
           <w:p>
             <w:r>
               <w:t xml:space="preserve">Actual Temp. of rm: ......... °C;</w:t>
             </w:r>
           </w:p>
-          <w:p>
-            <w:r>
-              <w:t xml:space="preserve"/>
-            </w:r>
-          </w:p>
+          <w:p/>
           <w:p>
             <w:r>
               <w:t xml:space="preserve">Actual Stirring: ......... rpm;</w:t>
             </w:r>
           </w:p>
-          <w:p>
-            <w:r>
-              <w:t xml:space="preserve"/>
-            </w:r>
-          </w:p>
+          <w:p/>
           <w:p>
             <w:r>
               <w:t xml:space="preserve">Actual Addition rate: .........;</w:t>
             </w:r>
           </w:p>
-          <w:p>
-            <w:r>
-              <w:t xml:space="preserve"/>
-            </w:r>
-          </w:p>
+          <w:p/>
           <w:p>
             <w:r>
               <w:t xml:space="preserve">Actual pH: .........;</w:t>
             </w:r>
           </w:p>
-          <w:p>
-            <w:r>
-              <w:t xml:space="preserve"/>
-            </w:r>
-          </w:p>
+          <w:p/>
         </w:tc>
       </w:tr>
       <w:tr>
         <w:tc>
           <w:p>
             <w:r>
-              <w:t xml:space="preserve">Start a heating/cooling operation:</w:t>
+              <w:rPr>
+                <w:b/>
+                <w:bCs/>
+              </w:rPr>
+              <w:t xml:space="preserve">Start</w:t>
+            </w:r>
+            <w:r>
+              <w:t xml:space="preserve"> a heating/cooling operation:</w:t>
             </w:r>
           </w:p>
           <w:p>
@@ -1037,29 +1223,65 @@
           </w:p>
           <w:p>
             <w:r>
-              <w:t xml:space="preserve">2. Set temperature on thermostat 011-XX to -5…0°C.</w:t>
-            </w:r>
-          </w:p>
-          <w:p>
-            <w:r>
-              <w:t xml:space="preserve">3. Keep the temperature of reaction mixture in range: 10-15°C.</w:t>
-            </w:r>
-          </w:p>
-          <w:p>
-            <w:r>
-              <w:t xml:space="preserve">4. Provide temperature gradient: straight cooling to the required temperature..</w:t>
-            </w:r>
-          </w:p>
-          <w:p>
-            <w:r>
-              <w:t xml:space="preserve">5. Set/Keep stirring rate to 150-200rpm.</w:t>
-            </w:r>
-          </w:p>
-          <w:p>
-            <w:r>
-              <w:t xml:space="preserve"/>
-            </w:r>
-          </w:p>
+              <w:t xml:space="preserve">2. Set temperature on thermostat 011-XX to </w:t>
+            </w:r>
+            <w:r>
+              <w:rPr>
+                <w:b/>
+                <w:bCs/>
+              </w:rPr>
+              <w:t xml:space="preserve">-5…0°C</w:t>
+            </w:r>
+            <w:r>
+              <w:t xml:space="preserve">.</w:t>
+            </w:r>
+          </w:p>
+          <w:p>
+            <w:r>
+              <w:t xml:space="preserve">3. Keep the temperature of reaction mixture in range: </w:t>
+            </w:r>
+            <w:r>
+              <w:rPr>
+                <w:b/>
+                <w:bCs/>
+              </w:rPr>
+              <w:t xml:space="preserve">10-15°C</w:t>
+            </w:r>
+            <w:r>
+              <w:t xml:space="preserve">.</w:t>
+            </w:r>
+          </w:p>
+          <w:p>
+            <w:r>
+              <w:t xml:space="preserve">4. Provide temperature gradient: </w:t>
+            </w:r>
+            <w:r>
+              <w:rPr>
+                <w:b/>
+                <w:bCs/>
+              </w:rPr>
+              <w:t xml:space="preserve">straight cooling to the required temperature.</w:t>
+            </w:r>
+            <w:r>
+              <w:t xml:space="preserve">.</w:t>
+            </w:r>
+          </w:p>
+          <w:p>
+            <w:r>
+              <w:t xml:space="preserve">5. Set/Keep stirring rate to </w:t>
+            </w:r>
+            <w:r>
+              <w:rPr>
+                <w:b/>
+                <w:bCs/>
+              </w:rPr>
+              <w:t xml:space="preserve">150-200rpm</w:t>
+            </w:r>
+            <w:r>
+              <w:t xml:space="preserve">.</w:t>
+            </w:r>
+          </w:p>
+          <w:p/>
           <w:p>
             <w:r>
               <w:t xml:space="preserve">Record required parameters into table XX.</w:t>
@@ -1094,90 +1316,123 @@
               <w:t xml:space="preserve">Actual Set temp.: .........;</w:t>
             </w:r>
           </w:p>
-          <w:p>
-            <w:r>
-              <w:t xml:space="preserve"/>
-            </w:r>
-          </w:p>
+          <w:p/>
           <w:p>
             <w:r>
               <w:t xml:space="preserve">Actual Target Temp.: .........;</w:t>
             </w:r>
           </w:p>
-          <w:p>
-            <w:r>
-              <w:t xml:space="preserve"/>
-            </w:r>
-          </w:p>
+          <w:p/>
           <w:p>
             <w:r>
               <w:t xml:space="preserve">Actual cooling/heating grad.: .........;</w:t>
             </w:r>
           </w:p>
-          <w:p>
-            <w:r>
-              <w:t xml:space="preserve"/>
-            </w:r>
-          </w:p>
+          <w:p/>
           <w:p>
             <w:r>
               <w:t xml:space="preserve">Actual Stirring: ......... rpm;</w:t>
             </w:r>
           </w:p>
-          <w:p>
-            <w:r>
-              <w:t xml:space="preserve"/>
-            </w:r>
-          </w:p>
+          <w:p/>
           <w:p>
             <w:r>
               <w:t xml:space="preserve">Actual break point: .........;</w:t>
             </w:r>
           </w:p>
-          <w:p>
-            <w:r>
-              <w:t xml:space="preserve"/>
-            </w:r>
-          </w:p>
+          <w:p/>
         </w:tc>
       </w:tr>
       <w:tr>
         <w:tc>
           <w:p>
             <w:r>
-              <w:t xml:space="preserve">Start a hold time operation:</w:t>
-            </w:r>
-          </w:p>
-          <w:p>
-            <w:r>
-              <w:t xml:space="preserve">1. Set temperature on thermostat 011-XX to 5…15°C.</w:t>
-            </w:r>
-          </w:p>
-          <w:p>
-            <w:r>
-              <w:t xml:space="preserve">2. Keep the temperature of reaction mixture in range: 10-15°C.</w:t>
-            </w:r>
-          </w:p>
-          <w:p>
-            <w:r>
-              <w:t xml:space="preserve">3. Adjust stirring rate to 150-200.</w:t>
-            </w:r>
-          </w:p>
-          <w:p>
-            <w:r>
-              <w:t xml:space="preserve">4. Hold for duration: 40-50min.</w:t>
-            </w:r>
-          </w:p>
-          <w:p>
-            <w:r>
-              <w:t xml:space="preserve">5. Optional: Possible pause - YES, when pH is 8-9.</w:t>
-            </w:r>
-          </w:p>
-          <w:p>
-            <w:r>
-              <w:t xml:space="preserve"/>
-            </w:r>
-          </w:p>
+              <w:rPr>
+                <w:b/>
+                <w:bCs/>
+              </w:rPr>
+              <w:t xml:space="preserve">Start</w:t>
+            </w:r>
+            <w:r>
+              <w:t xml:space="preserve"> a hold time operation:</w:t>
+            </w:r>
+          </w:p>
+          <w:p>
+            <w:r>
+              <w:t xml:space="preserve">1. Set temperature on thermostat 011-XX to </w:t>
+            </w:r>
+            <w:r>
+              <w:rPr>
+                <w:b/>
+                <w:bCs/>
+              </w:rPr>
+              <w:t xml:space="preserve">5…15°C</w:t>
+            </w:r>
+            <w:r>
+              <w:t xml:space="preserve">.</w:t>
+            </w:r>
+          </w:p>
+          <w:p>
+            <w:r>
+              <w:t xml:space="preserve">2. Keep the temperature of reaction mixture in range: </w:t>
+            </w:r>
+            <w:r>
+              <w:rPr>
+                <w:b/>
+                <w:bCs/>
+              </w:rPr>
+              <w:t xml:space="preserve">10-15°C</w:t>
+            </w:r>
+            <w:r>
+              <w:t xml:space="preserve">.</w:t>
+            </w:r>
+          </w:p>
+          <w:p>
+            <w:r>
+              <w:t xml:space="preserve">3. Adjust stirring rate to </w:t>
+            </w:r>
+            <w:r>
+              <w:rPr>
+                <w:b/>
+                <w:bCs/>
+              </w:rPr>
+              <w:t xml:space="preserve">150-200</w:t>
+            </w:r>
+            <w:r>
+              <w:t xml:space="preserve">.</w:t>
+            </w:r>
+          </w:p>
+          <w:p>
+            <w:r>
+              <w:t xml:space="preserve">4. Hold for duration: </w:t>
+            </w:r>
+            <w:r>
+              <w:rPr>
+                <w:b/>
+                <w:bCs/>
+              </w:rPr>
+              <w:t xml:space="preserve">40-50min</w:t>
+            </w:r>
+            <w:r>
+              <w:t xml:space="preserve">.</w:t>
+            </w:r>
+          </w:p>
+          <w:p>
+            <w:r>
+              <w:t xml:space="preserve">5. Optional: Possible pause - </w:t>
+            </w:r>
+            <w:r>
+              <w:rPr>
+                <w:b/>
+                <w:bCs/>
+              </w:rPr>
+              <w:t xml:space="preserve">YES, when pH is 8-9</w:t>
+            </w:r>
+            <w:r>
+              <w:t xml:space="preserve">.</w:t>
+            </w:r>
+          </w:p>
+          <w:p/>
           <w:p>
             <w:r>
               <w:t xml:space="preserve">Record required parameters into table XX.</w:t>
@@ -1212,58 +1467,45 @@
               <w:t xml:space="preserve">Actual Set temp.: .........;</w:t>
             </w:r>
           </w:p>
-          <w:p>
-            <w:r>
-              <w:t xml:space="preserve"/>
-            </w:r>
-          </w:p>
+          <w:p/>
           <w:p>
             <w:r>
               <w:t xml:space="preserve">Actual Target Temp.: .........;</w:t>
             </w:r>
           </w:p>
-          <w:p>
-            <w:r>
-              <w:t xml:space="preserve"/>
-            </w:r>
-          </w:p>
+          <w:p/>
           <w:p>
             <w:r>
               <w:t xml:space="preserve">Actual Stirring: ......... rpm;</w:t>
             </w:r>
           </w:p>
-          <w:p>
-            <w:r>
-              <w:t xml:space="preserve"/>
-            </w:r>
-          </w:p>
+          <w:p/>
           <w:p>
             <w:r>
               <w:t xml:space="preserve">Actual Time: .........;</w:t>
             </w:r>
           </w:p>
-          <w:p>
-            <w:r>
-              <w:t xml:space="preserve"/>
-            </w:r>
-          </w:p>
+          <w:p/>
           <w:p>
             <w:r>
               <w:t xml:space="preserve">Actual break point: .........;</w:t>
             </w:r>
           </w:p>
-          <w:p>
-            <w:r>
-              <w:t xml:space="preserve"/>
-            </w:r>
-          </w:p>
+          <w:p/>
         </w:tc>
       </w:tr>
       <w:tr>
         <w:tc>
           <w:p>
             <w:r>
-              <w:t xml:space="preserve">Filter 046-XX setup:</w:t>
+              <w:rPr>
+                <w:b/>
+                <w:bCs/>
+              </w:rPr>
+              <w:t xml:space="preserve">Filter</w:t>
+            </w:r>
+            <w:r>
+              <w:t xml:space="preserve"> 046-XX setup:</w:t>
             </w:r>
           </w:p>
           <w:p>
@@ -1320,18 +1562,21 @@
           </w:p>
         </w:tc>
         <w:tc>
-          <w:p>
-            <w:r>
-              <w:t xml:space="preserve"/>
-            </w:r>
-          </w:p>
+          <w:p/>
         </w:tc>
       </w:tr>
       <w:tr>
         <w:tc>
           <w:p>
             <w:r>
-              <w:t xml:space="preserve">Perform a filtration operation:</w:t>
+              <w:rPr>
+                <w:b/>
+                <w:bCs/>
+              </w:rPr>
+              <w:t xml:space="preserve">Perform</w:t>
+            </w:r>
+            <w:r>
+              <w:t xml:space="preserve"> a filtration operation:</w:t>
             </w:r>
           </w:p>
           <w:p>
@@ -1341,7 +1586,17 @@
           </w:p>
           <w:p>
             <w:r>
-              <w:t xml:space="preserve">2. Continue until: when Filter Cake is dry.. Use a spoon TP.3 ATI to press and remove cracks that might appear on filter cake.</w:t>
+              <w:t xml:space="preserve">2. Continue until: </w:t>
+            </w:r>
+            <w:r>
+              <w:rPr>
+                <w:b/>
+                <w:bCs/>
+              </w:rPr>
+              <w:t xml:space="preserve">when Filter Cake is dry.</w:t>
+            </w:r>
+            <w:r>
+              <w:t xml:space="preserve">. Use a spoon TP.3 ATI to press and remove cracks that might appear on filter cake.</w:t>
             </w:r>
           </w:p>
         </w:tc>
@@ -1373,28 +1628,27 @@
               <w:t xml:space="preserve">Actual End point: .........;</w:t>
             </w:r>
           </w:p>
-          <w:p>
-            <w:r>
-              <w:t xml:space="preserve"/>
-            </w:r>
-          </w:p>
+          <w:p/>
           <w:p>
             <w:r>
               <w:t xml:space="preserve">Actual vacuum: .........;</w:t>
             </w:r>
           </w:p>
-          <w:p>
-            <w:r>
-              <w:t xml:space="preserve"/>
-            </w:r>
-          </w:p>
+          <w:p/>
         </w:tc>
       </w:tr>
       <w:tr>
         <w:tc>
           <w:p>
             <w:r>
-              <w:t xml:space="preserve">Perform a Washing Filter Cake operation:</w:t>
+              <w:rPr>
+                <w:b/>
+                <w:bCs/>
+              </w:rPr>
+              <w:t xml:space="preserve">Perform</w:t>
+            </w:r>
+            <w:r>
+              <w:t xml:space="preserve"> a Washing Filter Cake operation:</w:t>
             </w:r>
           </w:p>
           <w:p>
@@ -1409,7 +1663,17 @@
           </w:p>
           <w:p>
             <w:r>
-              <w:t xml:space="preserve">3. Ensure loaded material temperature is rt/not controlled.</w:t>
+              <w:t xml:space="preserve">3. Ensure loaded material temperature is </w:t>
+            </w:r>
+            <w:r>
+              <w:rPr>
+                <w:b/>
+                <w:bCs/>
+              </w:rPr>
+              <w:t xml:space="preserve">rt/not controlled</w:t>
+            </w:r>
+            <w:r>
+              <w:t xml:space="preserve">.</w:t>
             </w:r>
           </w:p>
           <w:p>
@@ -1417,11 +1681,7 @@
               <w:t xml:space="preserve">4. Restart membrane pump and continue filtration.</w:t>
             </w:r>
           </w:p>
-          <w:p>
-            <w:r>
-              <w:t xml:space="preserve"/>
-            </w:r>
-          </w:p>
+          <w:p/>
           <w:p>
             <w:r>
               <w:t xml:space="preserve">Specified loading: ….. kg (range: … - … kg)</w:t>
@@ -1456,28 +1716,27 @@
               <w:t xml:space="preserve">Actual Loaded material temp.: .........;</w:t>
             </w:r>
           </w:p>
-          <w:p>
-            <w:r>
-              <w:t xml:space="preserve"/>
-            </w:r>
-          </w:p>
+          <w:p/>
           <w:p>
             <w:r>
               <w:t xml:space="preserve">Actual Mixing: .........;</w:t>
             </w:r>
           </w:p>
-          <w:p>
-            <w:r>
-              <w:t xml:space="preserve"/>
-            </w:r>
-          </w:p>
+          <w:p/>
         </w:tc>
       </w:tr>
       <w:tr>
         <w:tc>
           <w:p>
             <w:r>
-              <w:t xml:space="preserve">Perform a filtration operation:</w:t>
+              <w:rPr>
+                <w:b/>
+                <w:bCs/>
+              </w:rPr>
+              <w:t xml:space="preserve">Perform</w:t>
+            </w:r>
+            <w:r>
+              <w:t xml:space="preserve"> a filtration operation:</w:t>
             </w:r>
           </w:p>
           <w:p>
@@ -1487,7 +1746,17 @@
           </w:p>
           <w:p>
             <w:r>
-              <w:t xml:space="preserve">2. Continue until: when Filter Cake is dry.. Use a spoon TP.3 ATI to press and remove cracks that might appear on filter cake.</w:t>
+              <w:t xml:space="preserve">2. Continue until: </w:t>
+            </w:r>
+            <w:r>
+              <w:rPr>
+                <w:b/>
+                <w:bCs/>
+              </w:rPr>
+              <w:t xml:space="preserve">when Filter Cake is dry.</w:t>
+            </w:r>
+            <w:r>
+              <w:t xml:space="preserve">. Use a spoon TP.3 ATI to press and remove cracks that might appear on filter cake.</w:t>
             </w:r>
           </w:p>
         </w:tc>
@@ -1519,28 +1788,27 @@
               <w:t xml:space="preserve">Actual End point: .........;</w:t>
             </w:r>
           </w:p>
-          <w:p>
-            <w:r>
-              <w:t xml:space="preserve"/>
-            </w:r>
-          </w:p>
+          <w:p/>
           <w:p>
             <w:r>
               <w:t xml:space="preserve">Actual vacuum: .........;</w:t>
             </w:r>
           </w:p>
-          <w:p>
-            <w:r>
-              <w:t xml:space="preserve"/>
-            </w:r>
-          </w:p>
+          <w:p/>
         </w:tc>
       </w:tr>
       <w:tr>
         <w:tc>
           <w:p>
             <w:r>
-              <w:t xml:space="preserve">Perform a Washing Filter Cake operation:</w:t>
+              <w:rPr>
+                <w:b/>
+                <w:bCs/>
+              </w:rPr>
+              <w:t xml:space="preserve">Perform</w:t>
+            </w:r>
+            <w:r>
+              <w:t xml:space="preserve"> a Washing Filter Cake operation:</w:t>
             </w:r>
           </w:p>
           <w:p>
@@ -1555,7 +1823,17 @@
           </w:p>
           <w:p>
             <w:r>
-              <w:t xml:space="preserve">3. Ensure loaded material temperature is rt/not controlled.</w:t>
+              <w:t xml:space="preserve">3. Ensure loaded material temperature is </w:t>
+            </w:r>
+            <w:r>
+              <w:rPr>
+                <w:b/>
+                <w:bCs/>
+              </w:rPr>
+              <w:t xml:space="preserve">rt/not controlled</w:t>
+            </w:r>
+            <w:r>
+              <w:t xml:space="preserve">.</w:t>
             </w:r>
           </w:p>
           <w:p>
@@ -1563,11 +1841,7 @@
               <w:t xml:space="preserve">4. Restart membrane pump and continue filtration.</w:t>
             </w:r>
           </w:p>
-          <w:p>
-            <w:r>
-              <w:t xml:space="preserve"/>
-            </w:r>
-          </w:p>
+          <w:p/>
           <w:p>
             <w:r>
               <w:t xml:space="preserve">Specified loading: ….. kg (range: … - … kg)</w:t>
@@ -1602,28 +1876,27 @@
               <w:t xml:space="preserve">Actual Loaded material temp.: .........;</w:t>
             </w:r>
           </w:p>
-          <w:p>
-            <w:r>
-              <w:t xml:space="preserve"/>
-            </w:r>
-          </w:p>
+          <w:p/>
           <w:p>
             <w:r>
               <w:t xml:space="preserve">Actual Mixing: .........;</w:t>
             </w:r>
           </w:p>
-          <w:p>
-            <w:r>
-              <w:t xml:space="preserve"/>
-            </w:r>
-          </w:p>
+          <w:p/>
         </w:tc>
       </w:tr>
       <w:tr>
         <w:tc>
           <w:p>
             <w:r>
-              <w:t xml:space="preserve">Perform a filtration operation:</w:t>
+              <w:rPr>
+                <w:b/>
+                <w:bCs/>
+              </w:rPr>
+              <w:t xml:space="preserve">Perform</w:t>
+            </w:r>
+            <w:r>
+              <w:t xml:space="preserve"> a filtration operation:</w:t>
             </w:r>
           </w:p>
           <w:p>
@@ -1633,7 +1906,17 @@
           </w:p>
           <w:p>
             <w:r>
-              <w:t xml:space="preserve">2. Continue until: when Filter Cake is dry.. Use a spoon TP.3 ATI to press and remove cracks that might appear on filter cake.</w:t>
+              <w:t xml:space="preserve">2. Continue until: </w:t>
+            </w:r>
+            <w:r>
+              <w:rPr>
+                <w:b/>
+                <w:bCs/>
+              </w:rPr>
+              <w:t xml:space="preserve">when Filter Cake is dry.</w:t>
+            </w:r>
+            <w:r>
+              <w:t xml:space="preserve">. Use a spoon TP.3 ATI to press and remove cracks that might appear on filter cake.</w:t>
             </w:r>
           </w:p>
         </w:tc>
@@ -1665,28 +1948,27 @@
               <w:t xml:space="preserve">Actual End point: .........;</w:t>
             </w:r>
           </w:p>
-          <w:p>
-            <w:r>
-              <w:t xml:space="preserve"/>
-            </w:r>
-          </w:p>
+          <w:p/>
           <w:p>
             <w:r>
               <w:t xml:space="preserve">Actual vacuum: .........;</w:t>
             </w:r>
           </w:p>
-          <w:p>
-            <w:r>
-              <w:t xml:space="preserve"/>
-            </w:r>
-          </w:p>
+          <w:p/>
         </w:tc>
       </w:tr>
       <w:tr>
         <w:tc>
           <w:p>
             <w:r>
-              <w:t xml:space="preserve">Dry the filter cake on filter under vacuum:</w:t>
+              <w:rPr>
+                <w:b/>
+                <w:bCs/>
+              </w:rPr>
+              <w:t xml:space="preserve">Dry</w:t>
+            </w:r>
+            <w:r>
+              <w:t xml:space="preserve"> the filter cake on filter under vacuum:</w:t>
             </w:r>
           </w:p>
           <w:p>
@@ -1733,28 +2015,27 @@
               <w:t xml:space="preserve">Actual Time: .........;</w:t>
             </w:r>
           </w:p>
-          <w:p>
-            <w:r>
-              <w:t xml:space="preserve"/>
-            </w:r>
-          </w:p>
+          <w:p/>
           <w:p>
             <w:r>
               <w:t xml:space="preserve">Actual vacuum: .........;</w:t>
             </w:r>
           </w:p>
-          <w:p>
-            <w:r>
-              <w:t xml:space="preserve"/>
-            </w:r>
-          </w:p>
+          <w:p/>
         </w:tc>
       </w:tr>
       <w:tr>
         <w:tc>
           <w:p>
             <w:r>
-              <w:t xml:space="preserve">Perform a Washing Filter Cake operation:</w:t>
+              <w:rPr>
+                <w:b/>
+                <w:bCs/>
+              </w:rPr>
+              <w:t xml:space="preserve">Perform</w:t>
+            </w:r>
+            <w:r>
+              <w:t xml:space="preserve"> a Washing Filter Cake operation:</w:t>
             </w:r>
           </w:p>
           <w:p>
@@ -1769,7 +2050,17 @@
           </w:p>
           <w:p>
             <w:r>
-              <w:t xml:space="preserve">3. Ensure loaded material temperature is not controlled.</w:t>
+              <w:t xml:space="preserve">3. Ensure loaded material temperature is </w:t>
+            </w:r>
+            <w:r>
+              <w:rPr>
+                <w:b/>
+                <w:bCs/>
+              </w:rPr>
+              <w:t xml:space="preserve">not controlled</w:t>
+            </w:r>
+            <w:r>
+              <w:t xml:space="preserve">.</w:t>
             </w:r>
           </w:p>
           <w:p>
@@ -1777,11 +2068,7 @@
               <w:t xml:space="preserve">4. Restart membrane pump and continue filtration.</w:t>
             </w:r>
           </w:p>
-          <w:p>
-            <w:r>
-              <w:t xml:space="preserve"/>
-            </w:r>
-          </w:p>
+          <w:p/>
           <w:p>
             <w:r>
               <w:t xml:space="preserve">Specified loading: ….. kg (range: … - … kg)</w:t>
@@ -1816,55 +2103,90 @@
               <w:t xml:space="preserve">Actual Loaded material temp.: .........;</w:t>
             </w:r>
           </w:p>
-          <w:p>
-            <w:r>
-              <w:t xml:space="preserve"/>
-            </w:r>
-          </w:p>
+          <w:p/>
           <w:p>
             <w:r>
               <w:t xml:space="preserve">Actual Stirring: ......... rpm;</w:t>
             </w:r>
           </w:p>
-          <w:p>
-            <w:r>
-              <w:t xml:space="preserve"/>
-            </w:r>
-          </w:p>
+          <w:p/>
         </w:tc>
       </w:tr>
       <w:tr>
         <w:tc>
           <w:p>
             <w:r>
-              <w:t xml:space="preserve">Start a hold time operation:</w:t>
-            </w:r>
-          </w:p>
-          <w:p>
-            <w:r>
-              <w:t xml:space="preserve">1. Set temperature on thermostat 011-XX to tbd.</w:t>
-            </w:r>
-          </w:p>
-          <w:p>
-            <w:r>
-              <w:t xml:space="preserve">2. Keep the temperature of reaction mixture in range: 0-4°C [WARNING, PARAMETER IS CY].</w:t>
-            </w:r>
-          </w:p>
-          <w:p>
-            <w:r>
-              <w:t xml:space="preserve">3. Adjust stirring rate to 100-120Torr.</w:t>
-            </w:r>
-          </w:p>
-          <w:p>
-            <w:r>
-              <w:t xml:space="preserve">4. Hold for duration: 20-30min.</w:t>
-            </w:r>
-          </w:p>
-          <w:p>
-            <w:r>
-              <w:t xml:space="preserve"/>
-            </w:r>
-          </w:p>
+              <w:rPr>
+                <w:b/>
+                <w:bCs/>
+              </w:rPr>
+              <w:t xml:space="preserve">Start</w:t>
+            </w:r>
+            <w:r>
+              <w:t xml:space="preserve"> a hold time operation:</w:t>
+            </w:r>
+          </w:p>
+          <w:p>
+            <w:r>
+              <w:t xml:space="preserve">1. Set temperature on thermostat 011-XX to </w:t>
+            </w:r>
+            <w:r>
+              <w:rPr>
+                <w:b/>
+                <w:bCs/>
+              </w:rPr>
+              <w:t xml:space="preserve">tbd</w:t>
+            </w:r>
+            <w:r>
+              <w:t xml:space="preserve">.</w:t>
+            </w:r>
+          </w:p>
+          <w:p>
+            <w:r>
+              <w:t xml:space="preserve">2. Keep the temperature of reaction mixture in range: </w:t>
+            </w:r>
+            <w:r>
+              <w:rPr>
+                <w:b/>
+                <w:bCs/>
+              </w:rPr>
+              <w:t xml:space="preserve">0-4°C [WARNING, PARAMETER IS CY]</w:t>
+            </w:r>
+            <w:r>
+              <w:t xml:space="preserve">.</w:t>
+            </w:r>
+          </w:p>
+          <w:p>
+            <w:r>
+              <w:t xml:space="preserve">3. Adjust stirring rate to </w:t>
+            </w:r>
+            <w:r>
+              <w:rPr>
+                <w:b/>
+                <w:bCs/>
+              </w:rPr>
+              <w:t xml:space="preserve">100-120Torr</w:t>
+            </w:r>
+            <w:r>
+              <w:t xml:space="preserve">.</w:t>
+            </w:r>
+          </w:p>
+          <w:p>
+            <w:r>
+              <w:t xml:space="preserve">4. Hold for duration: </w:t>
+            </w:r>
+            <w:r>
+              <w:rPr>
+                <w:b/>
+                <w:bCs/>
+              </w:rPr>
+              <w:t xml:space="preserve">20-30min</w:t>
+            </w:r>
+            <w:r>
+              <w:t xml:space="preserve">.</w:t>
+            </w:r>
+          </w:p>
+          <w:p/>
           <w:p>
             <w:r>
               <w:t xml:space="preserve">Record required parameters into table XX.</w:t>
@@ -1899,48 +2221,39 @@
               <w:t xml:space="preserve">Actual Set temp.: .........;</w:t>
             </w:r>
           </w:p>
-          <w:p>
-            <w:r>
-              <w:t xml:space="preserve"/>
-            </w:r>
-          </w:p>
+          <w:p/>
           <w:p>
             <w:r>
               <w:t xml:space="preserve">Actual Target Temp.: .........;</w:t>
             </w:r>
           </w:p>
-          <w:p>
-            <w:r>
-              <w:t xml:space="preserve"/>
-            </w:r>
-          </w:p>
+          <w:p/>
           <w:p>
             <w:r>
               <w:t xml:space="preserve">Actual Stirring: ......... rpm;</w:t>
             </w:r>
           </w:p>
-          <w:p>
-            <w:r>
-              <w:t xml:space="preserve"/>
-            </w:r>
-          </w:p>
+          <w:p/>
           <w:p>
             <w:r>
               <w:t xml:space="preserve">Actual Time: .........;</w:t>
             </w:r>
           </w:p>
-          <w:p>
-            <w:r>
-              <w:t xml:space="preserve"/>
-            </w:r>
-          </w:p>
+          <w:p/>
         </w:tc>
       </w:tr>
       <w:tr>
         <w:tc>
           <w:p>
             <w:r>
-              <w:t xml:space="preserve">Perform a filtration operation:</w:t>
+              <w:rPr>
+                <w:b/>
+                <w:bCs/>
+              </w:rPr>
+              <w:t xml:space="preserve">Perform</w:t>
+            </w:r>
+            <w:r>
+              <w:t xml:space="preserve"> a filtration operation:</w:t>
             </w:r>
           </w:p>
           <w:p>
@@ -1950,7 +2263,17 @@
           </w:p>
           <w:p>
             <w:r>
-              <w:t xml:space="preserve">2. Continue until: when FK is dry.. Use a spoon TP.3 ATI to press and remove cracks that might appear on filter cake.</w:t>
+              <w:t xml:space="preserve">2. Continue until: </w:t>
+            </w:r>
+            <w:r>
+              <w:rPr>
+                <w:b/>
+                <w:bCs/>
+              </w:rPr>
+              <w:t xml:space="preserve">when FK is dry.</w:t>
+            </w:r>
+            <w:r>
+              <w:t xml:space="preserve">. Use a spoon TP.3 ATI to press and remove cracks that might appear on filter cake.</w:t>
             </w:r>
           </w:p>
         </w:tc>
@@ -1982,28 +2305,27 @@
               <w:t xml:space="preserve">Actual End point: .........;</w:t>
             </w:r>
           </w:p>
-          <w:p>
-            <w:r>
-              <w:t xml:space="preserve"/>
-            </w:r>
-          </w:p>
+          <w:p/>
           <w:p>
             <w:r>
               <w:t xml:space="preserve">Actual vacuum: .........;</w:t>
             </w:r>
           </w:p>
-          <w:p>
-            <w:r>
-              <w:t xml:space="preserve"/>
-            </w:r>
-          </w:p>
+          <w:p/>
         </w:tc>
       </w:tr>
       <w:tr>
         <w:tc>
           <w:p>
             <w:r>
-              <w:t xml:space="preserve">Load required amount of 2-propanol into Reactor 002-XX:</w:t>
+              <w:rPr>
+                <w:b/>
+                <w:bCs/>
+              </w:rPr>
+              <w:t xml:space="preserve">Load</w:t>
+            </w:r>
+            <w:r>
+              <w:t xml:space="preserve"> required amount of 2-propanol into Reactor 002-XX:</w:t>
             </w:r>
           </w:p>
           <w:p>
@@ -2023,24 +2345,26 @@
           </w:p>
           <w:p>
             <w:r>
-              <w:t xml:space="preserve">4. Addition is done - addition in one portion.</w:t>
-            </w:r>
-          </w:p>
-          <w:p>
-            <w:r>
-              <w:t xml:space="preserve"/>
-            </w:r>
-          </w:p>
+              <w:t xml:space="preserve">4. Addition is done - </w:t>
+            </w:r>
+            <w:r>
+              <w:rPr>
+                <w:b/>
+                <w:bCs/>
+              </w:rPr>
+              <w:t xml:space="preserve">addition in one portion</w:t>
+            </w:r>
+            <w:r>
+              <w:t xml:space="preserve">.</w:t>
+            </w:r>
+          </w:p>
+          <w:p/>
           <w:p>
             <w:r>
               <w:t xml:space="preserve">Record required parameters into table XX.</w:t>
             </w:r>
           </w:p>
-          <w:p>
-            <w:r>
-              <w:t xml:space="preserve"/>
-            </w:r>
-          </w:p>
+          <w:p/>
           <w:p>
             <w:r>
               <w:t xml:space="preserve">Specified loading: ….. kg (range: … - … kg)</w:t>
@@ -2075,18 +2399,21 @@
               <w:t xml:space="preserve">Actual Addition rate: .........;</w:t>
             </w:r>
           </w:p>
-          <w:p>
-            <w:r>
-              <w:t xml:space="preserve"/>
-            </w:r>
-          </w:p>
+          <w:p/>
         </w:tc>
       </w:tr>
       <w:tr>
         <w:tc>
           <w:p>
             <w:r>
-              <w:t xml:space="preserve">Perform a filtration operation:</w:t>
+              <w:rPr>
+                <w:b/>
+                <w:bCs/>
+              </w:rPr>
+              <w:t xml:space="preserve">Perform</w:t>
+            </w:r>
+            <w:r>
+              <w:t xml:space="preserve"> a filtration operation:</w:t>
             </w:r>
           </w:p>
           <w:p>
@@ -2096,7 +2423,17 @@
           </w:p>
           <w:p>
             <w:r>
-              <w:t xml:space="preserve">2. Continue until: when FK is dry.. Use a spoon TP.3 ATI to press and remove cracks that might appear on filter cake.</w:t>
+              <w:t xml:space="preserve">2. Continue until: </w:t>
+            </w:r>
+            <w:r>
+              <w:rPr>
+                <w:b/>
+                <w:bCs/>
+              </w:rPr>
+              <w:t xml:space="preserve">when FK is dry.</w:t>
+            </w:r>
+            <w:r>
+              <w:t xml:space="preserve">. Use a spoon TP.3 ATI to press and remove cracks that might appear on filter cake.</w:t>
             </w:r>
           </w:p>
         </w:tc>
@@ -2128,28 +2465,27 @@
               <w:t xml:space="preserve">Actual End point: .........;</w:t>
             </w:r>
           </w:p>
-          <w:p>
-            <w:r>
-              <w:t xml:space="preserve"/>
-            </w:r>
-          </w:p>
+          <w:p/>
           <w:p>
             <w:r>
               <w:t xml:space="preserve">Actual vacuum: .........;</w:t>
             </w:r>
           </w:p>
-          <w:p>
-            <w:r>
-              <w:t xml:space="preserve"/>
-            </w:r>
-          </w:p>
+          <w:p/>
         </w:tc>
       </w:tr>
       <w:tr>
         <w:tc>
           <w:p>
             <w:r>
-              <w:t xml:space="preserve">Dry the filter cake on filter under vacuum:</w:t>
+              <w:rPr>
+                <w:b/>
+                <w:bCs/>
+              </w:rPr>
+              <w:t xml:space="preserve">Dry</w:t>
+            </w:r>
+            <w:r>
+              <w:t xml:space="preserve"> the filter cake on filter under vacuum:</w:t>
             </w:r>
           </w:p>
           <w:p>
@@ -2196,28 +2532,27 @@
               <w:t xml:space="preserve">Actual Time: .........;</w:t>
             </w:r>
           </w:p>
-          <w:p>
-            <w:r>
-              <w:t xml:space="preserve"/>
-            </w:r>
-          </w:p>
+          <w:p/>
           <w:p>
             <w:r>
               <w:t xml:space="preserve">Actual vacuum: .........;</w:t>
             </w:r>
           </w:p>
-          <w:p>
-            <w:r>
-              <w:t xml:space="preserve"/>
-            </w:r>
-          </w:p>
+          <w:p/>
         </w:tc>
       </w:tr>
       <w:tr>
         <w:tc>
           <w:p>
             <w:r>
-              <w:t xml:space="preserve">Dry the product in vacuum oven 012-XX:</w:t>
+              <w:rPr>
+                <w:b/>
+                <w:bCs/>
+              </w:rPr>
+              <w:t xml:space="preserve">Dry</w:t>
+            </w:r>
+            <w:r>
+              <w:t xml:space="preserve"> the product in vacuum oven 012-XX:</w:t>
             </w:r>
           </w:p>
           <w:p>
@@ -2227,7 +2562,17 @@
           </w:p>
           <w:p>
             <w:r>
-              <w:t xml:space="preserve">2. Transfer the product (filter cake) onto trays with a layer thickness of 4cm.</w:t>
+              <w:t xml:space="preserve">2. Transfer the product (filter cake) onto trays with a layer thickness of </w:t>
+            </w:r>
+            <w:r>
+              <w:rPr>
+                <w:b/>
+                <w:bCs/>
+              </w:rPr>
+              <w:t xml:space="preserve">4cm</w:t>
+            </w:r>
+            <w:r>
+              <w:t xml:space="preserve">.</w:t>
             </w:r>
           </w:p>
           <w:p>
@@ -2242,24 +2587,60 @@
           </w:p>
           <w:p>
             <w:r>
-              <w:t xml:space="preserve">5. Set the oven temperature to; 40°C and start the pump with set: &lt;30Torr.</w:t>
-            </w:r>
-          </w:p>
-          <w:p>
-            <w:r>
-              <w:t xml:space="preserve">6. Dry the product, checking the weight periodically (NLT 12h after start of drying) to determine dryness as long as needed..</w:t>
-            </w:r>
-          </w:p>
-          <w:p>
-            <w:r>
-              <w:t xml:space="preserve">7. Perform Mix/delump: yes.</w:t>
-            </w:r>
-          </w:p>
-          <w:p>
-            <w:r>
-              <w:t xml:space="preserve"/>
-            </w:r>
-          </w:p>
+              <w:t xml:space="preserve">5. Set the oven temperature to; </w:t>
+            </w:r>
+            <w:r>
+              <w:rPr>
+                <w:b/>
+                <w:bCs/>
+              </w:rPr>
+              <w:t xml:space="preserve">40°C</w:t>
+            </w:r>
+            <w:r>
+              <w:t xml:space="preserve"> and start the pump with set: </w:t>
+            </w:r>
+            <w:r>
+              <w:rPr>
+                <w:b/>
+                <w:bCs/>
+              </w:rPr>
+              <w:t xml:space="preserve">&lt;30Torr</w:t>
+            </w:r>
+            <w:r>
+              <w:t xml:space="preserve">.</w:t>
+            </w:r>
+          </w:p>
+          <w:p>
+            <w:r>
+              <w:t xml:space="preserve">6. Dry the product, checking the weight periodically (NLT 12h after start of drying) to determine dryness </w:t>
+            </w:r>
+            <w:r>
+              <w:rPr>
+                <w:b/>
+                <w:bCs/>
+              </w:rPr>
+              <w:t xml:space="preserve">as long as needed.</w:t>
+            </w:r>
+            <w:r>
+              <w:t xml:space="preserve">.</w:t>
+            </w:r>
+          </w:p>
+          <w:p>
+            <w:r>
+              <w:t xml:space="preserve">7. Perform Mix/delump: </w:t>
+            </w:r>
+            <w:r>
+              <w:rPr>
+                <w:b/>
+                <w:bCs/>
+              </w:rPr>
+              <w:t xml:space="preserve">yes</w:t>
+            </w:r>
+            <w:r>
+              <w:t xml:space="preserve">.</w:t>
+            </w:r>
+          </w:p>
+          <w:p/>
         </w:tc>
         <w:tc>
           <w:p>
@@ -2289,78 +2670,57 @@
               <w:t xml:space="preserve">Actual Set temp.: .........;</w:t>
             </w:r>
           </w:p>
-          <w:p>
-            <w:r>
-              <w:t xml:space="preserve"/>
-            </w:r>
-          </w:p>
+          <w:p/>
           <w:p>
             <w:r>
               <w:t xml:space="preserve">Actual Vacuum: .........;</w:t>
             </w:r>
           </w:p>
-          <w:p>
-            <w:r>
-              <w:t xml:space="preserve"/>
-            </w:r>
-          </w:p>
+          <w:p/>
           <w:p>
             <w:r>
               <w:t xml:space="preserve">Actual layer thickness: .........;</w:t>
             </w:r>
           </w:p>
-          <w:p>
-            <w:r>
-              <w:t xml:space="preserve"/>
-            </w:r>
-          </w:p>
+          <w:p/>
           <w:p>
             <w:r>
               <w:t xml:space="preserve">Actual mixing/delumping: .........;</w:t>
             </w:r>
           </w:p>
-          <w:p>
-            <w:r>
-              <w:t xml:space="preserve"/>
-            </w:r>
-          </w:p>
+          <w:p/>
           <w:p>
             <w:r>
               <w:t xml:space="preserve">Actual Time: .........;</w:t>
             </w:r>
           </w:p>
-          <w:p>
-            <w:r>
-              <w:t xml:space="preserve"/>
-            </w:r>
-          </w:p>
+          <w:p/>
           <w:p>
             <w:r>
               <w:t xml:space="preserve">Actual Exp. Yield: .........;</w:t>
             </w:r>
           </w:p>
-          <w:p>
-            <w:r>
-              <w:t xml:space="preserve"/>
-            </w:r>
-          </w:p>
+          <w:p/>
           <w:p>
             <w:r>
               <w:t xml:space="preserve">Actual Exp. Mass: .........;</w:t>
             </w:r>
           </w:p>
-          <w:p>
-            <w:r>
-              <w:t xml:space="preserve"/>
-            </w:r>
-          </w:p>
+          <w:p/>
         </w:tc>
       </w:tr>
       <w:tr>
         <w:tc>
           <w:p>
             <w:r>
-              <w:t xml:space="preserve">Finish drying:</w:t>
+              <w:rPr>
+                <w:b/>
+                <w:bCs/>
+              </w:rPr>
+              <w:t xml:space="preserve">Finish</w:t>
+            </w:r>
+            <w:r>
+              <w:t xml:space="preserve"> drying:</w:t>
             </w:r>
           </w:p>
           <w:p>
@@ -2383,11 +2743,7 @@
               <w:t xml:space="preserve">4. Calculate process yield:</w:t>
             </w:r>
           </w:p>
-          <w:p>
-            <w:r>
-              <w:t xml:space="preserve"/>
-            </w:r>
-          </w:p>
+          <w:p/>
         </w:tc>
         <w:tc>
           <w:p>
@@ -2412,18 +2768,21 @@
           </w:p>
         </w:tc>
         <w:tc>
-          <w:p>
-            <w:r>
-              <w:t xml:space="preserve"/>
-            </w:r>
-          </w:p>
+          <w:p/>
         </w:tc>
       </w:tr>
       <w:tr>
         <w:tc>
           <w:p>
             <w:r>
-              <w:t xml:space="preserve">after drying prod. Is sampled and packed.</w:t>
+              <w:rPr>
+                <w:b/>
+                <w:bCs/>
+              </w:rPr>
+              <w:t xml:space="preserve">after</w:t>
+            </w:r>
+            <w:r>
+              <w:t xml:space="preserve"> drying prod. Is sampled and packed.</w:t>
             </w:r>
           </w:p>
         </w:tc>
@@ -2455,38 +2814,33 @@
               <w:t xml:space="preserve">Actual pack. Mat.: .........;</w:t>
             </w:r>
           </w:p>
-          <w:p>
-            <w:r>
-              <w:t xml:space="preserve"/>
-            </w:r>
-          </w:p>
+          <w:p/>
           <w:p>
             <w:r>
               <w:t xml:space="preserve">Actual Analyt sample: .........;</w:t>
             </w:r>
           </w:p>
-          <w:p>
-            <w:r>
-              <w:t xml:space="preserve"/>
-            </w:r>
-          </w:p>
+          <w:p/>
           <w:p>
             <w:r>
               <w:t xml:space="preserve">Actual Ret sample: .........;</w:t>
             </w:r>
           </w:p>
-          <w:p>
-            <w:r>
-              <w:t xml:space="preserve"/>
-            </w:r>
-          </w:p>
+          <w:p/>
         </w:tc>
       </w:tr>
       <w:tr>
         <w:tc>
           <w:p>
             <w:r>
-              <w:t xml:space="preserve">Perform the analysis according to QDQS:</w:t>
+              <w:rPr>
+                <w:b/>
+                <w:bCs/>
+              </w:rPr>
+              <w:t xml:space="preserve">Perform</w:t>
+            </w:r>
+            <w:r>
+              <w:t xml:space="preserve"> the analysis according to QDQS:</w:t>
             </w:r>
           </w:p>
           <w:p>
@@ -2528,28 +2882,27 @@
               <w:t xml:space="preserve">Actual YES: .........;</w:t>
             </w:r>
           </w:p>
-          <w:p>
-            <w:r>
-              <w:t xml:space="preserve"/>
-            </w:r>
-          </w:p>
+          <w:p/>
           <w:p>
             <w:r>
               <w:t xml:space="preserve">Actual NO: .........;</w:t>
             </w:r>
           </w:p>
-          <w:p>
-            <w:r>
-              <w:t xml:space="preserve"/>
-            </w:r>
-          </w:p>
+          <w:p/>
         </w:tc>
       </w:tr>
       <w:tr>
         <w:tc>
           <w:p>
             <w:r>
-              <w:t xml:space="preserve">Reactors and filters are cleaned</w:t>
+              <w:rPr>
+                <w:b/>
+                <w:bCs/>
+              </w:rPr>
+              <w:t xml:space="preserve">Reactors</w:t>
+            </w:r>
+            <w:r>
+              <w:t xml:space="preserve"> and filters are cleaned</w:t>
             </w:r>
           </w:p>
         </w:tc>
@@ -2581,28 +2934,27 @@
               <w:t xml:space="preserve">Actual solvent: .........;</w:t>
             </w:r>
           </w:p>
-          <w:p>
-            <w:r>
-              <w:t xml:space="preserve"/>
-            </w:r>
-          </w:p>
+          <w:p/>
           <w:p>
             <w:r>
               <w:t xml:space="preserve">Actual time required: .........;</w:t>
             </w:r>
           </w:p>
-          <w:p>
-            <w:r>
-              <w:t xml:space="preserve"/>
-            </w:r>
-          </w:p>
+          <w:p/>
         </w:tc>
       </w:tr>
       <w:tr>
         <w:tc>
           <w:p>
             <w:r>
-              <w:t xml:space="preserve">Perform waste treatment:</w:t>
+              <w:rPr>
+                <w:b/>
+                <w:bCs/>
+              </w:rPr>
+              <w:t xml:space="preserve">Perform</w:t>
+            </w:r>
+            <w:r>
+              <w:t xml:space="preserve"> waste treatment:</w:t>
             </w:r>
           </w:p>
         </w:tc>
@@ -2629,11 +2981,7 @@
           </w:p>
         </w:tc>
         <w:tc>
-          <w:p>
-            <w:r>
-              <w:t xml:space="preserve"/>
-            </w:r>
-          </w:p>
+          <w:p/>
         </w:tc>
       </w:tr>
     </w:tbl>

</xml_diff>